<commit_message>
Enhance PDF User Guide with Post-Launch Opening the App walkthrough and styled ReportLab canvas page numbers
</commit_message>
<xml_diff>
--- a/Orbit_Complete_User_Guide.docx
+++ b/Orbit_Complete_User_Guide.docx
@@ -24,9 +24,9 @@
       <w:r>
         <w:rPr>
           <w:color w:val="6B7280"/>
-          <w:sz w:val="24"/>
+          <w:sz w:val="22"/>
         </w:rPr>
-        <w:t>100% Air-Gapped Intelligence · Installation · Feature Guide · Screenshot Tour</w:t>
+        <w:t>100% Air-Gapped Intelligence · Installation · Post-Launch Walkthrough · Feature Guide</w:t>
       </w:r>
     </w:p>
     <w:p>
@@ -39,9 +39,6 @@
         <w:pStyle w:val="Heading1"/>
       </w:pPr>
       <w:r>
-        <w:rPr>
-          <w:color w:val="1E293B"/>
-        </w:rPr>
         <w:t>1. Executive Overview &amp; Mission</w:t>
       </w:r>
     </w:p>
@@ -49,131 +46,6 @@
       <w:r>
         <w:t>Orbit is an advanced, local-first Retrieval-Augmented Generation (RAG) platform designed to deliver enterprise-grade document intelligence without sending a single byte of data to external cloud servers. Powered by local vector search, sparse Rank-BM25 recency reranking, and Ollama local LLMs (llama3.2:3b), Orbit ensures complete privacy, zero API costs, and air-gapped security.</w:t>
       </w:r>
-    </w:p>
-    <w:tbl>
-      <w:tblPr>
-        <w:tblW w:type="auto" w:w="0"/>
-        <w:jc w:val="center"/>
-        <w:tblLayout w:type="fixed"/>
-        <w:tblLook w:firstColumn="1" w:firstRow="1" w:lastColumn="0" w:lastRow="0" w:noHBand="0" w:noVBand="1" w:val="04A0"/>
-      </w:tblPr>
-      <w:tblGrid>
-        <w:gridCol w:w="4320"/>
-        <w:gridCol w:w="4320"/>
-      </w:tblGrid>
-      <w:tr>
-        <w:tc>
-          <w:tcPr>
-            <w:tcW w:type="dxa" w:w="3168"/>
-            <w:shd w:val="clear" w:color="auto" w:fill="F1F5F9"/>
-          </w:tcPr>
-          <w:p>
-            <w:r>
-              <w:rPr>
-                <w:b/>
-              </w:rPr>
-              <w:t>Platform Name</w:t>
-            </w:r>
-          </w:p>
-        </w:tc>
-        <w:tc>
-          <w:tcPr>
-            <w:tcW w:type="dxa" w:w="6192"/>
-            <w:shd w:val="clear" w:color="auto" w:fill="F8FAFC"/>
-          </w:tcPr>
-          <w:p>
-            <w:r>
-              <w:t>Orbit (Offline Multimodal RAG Assistant)</w:t>
-            </w:r>
-          </w:p>
-        </w:tc>
-      </w:tr>
-      <w:tr>
-        <w:tc>
-          <w:tcPr>
-            <w:tcW w:type="dxa" w:w="3168"/>
-            <w:shd w:val="clear" w:color="auto" w:fill="F1F5F9"/>
-          </w:tcPr>
-          <w:p>
-            <w:r>
-              <w:rPr>
-                <w:b/>
-              </w:rPr>
-              <w:t>Live Website URL</w:t>
-            </w:r>
-          </w:p>
-        </w:tc>
-        <w:tc>
-          <w:tcPr>
-            <w:tcW w:type="dxa" w:w="6192"/>
-            <w:shd w:val="clear" w:color="auto" w:fill="F8FAFC"/>
-          </w:tcPr>
-          <w:p>
-            <w:r>
-              <w:t>https://offlinerag-psi.vercel.app</w:t>
-            </w:r>
-          </w:p>
-        </w:tc>
-      </w:tr>
-      <w:tr>
-        <w:tc>
-          <w:tcPr>
-            <w:tcW w:type="dxa" w:w="3168"/>
-            <w:shd w:val="clear" w:color="auto" w:fill="F1F5F9"/>
-          </w:tcPr>
-          <w:p>
-            <w:r>
-              <w:rPr>
-                <w:b/>
-              </w:rPr>
-              <w:t>Setup Download Package</w:t>
-            </w:r>
-          </w:p>
-        </w:tc>
-        <w:tc>
-          <w:tcPr>
-            <w:tcW w:type="dxa" w:w="6192"/>
-            <w:shd w:val="clear" w:color="auto" w:fill="F8FAFC"/>
-          </w:tcPr>
-          <w:p>
-            <w:r>
-              <w:t>https://github.com/kalakonda-akshay/RAG/releases/latest/download/OfflineRAGAssistant_Setup.zip</w:t>
-            </w:r>
-          </w:p>
-        </w:tc>
-      </w:tr>
-      <w:tr>
-        <w:tc>
-          <w:tcPr>
-            <w:tcW w:type="dxa" w:w="3168"/>
-            <w:shd w:val="clear" w:color="auto" w:fill="F1F5F9"/>
-          </w:tcPr>
-          <w:p>
-            <w:r>
-              <w:rPr>
-                <w:b/>
-              </w:rPr>
-              <w:t>Supported File Formats</w:t>
-            </w:r>
-          </w:p>
-        </w:tc>
-        <w:tc>
-          <w:tcPr>
-            <w:tcW w:type="dxa" w:w="6192"/>
-            <w:shd w:val="clear" w:color="auto" w:fill="F8FAFC"/>
-          </w:tcPr>
-          <w:p>
-            <w:r>
-              <w:t>29 Extensions (PDF, Word, Excel, PowerPoint, Audio, Video, Images, SQL)</w:t>
-            </w:r>
-          </w:p>
-        </w:tc>
-      </w:tr>
-    </w:tbl>
-    <w:p>
-      <w:pPr>
-        <w:spacing w:after="240"/>
-      </w:pPr>
     </w:p>
     <w:p>
       <w:pPr>
@@ -185,73 +57,15 @@
     </w:p>
     <w:p>
       <w:r>
-        <w:rPr>
-          <w:b/>
-        </w:rPr>
-        <w:t>Step 1: Download the Application Package</w:t>
+        <w:t>• Download Setup Package: https://github.com/kalakonda-akshay/RAG/releases/latest/download/OfflineRAGAssistant_Setup.zip</w:t>
         <w:br/>
-      </w:r>
-      <w:r>
-        <w:t>Visit the live production web portal at https://offlinerag-psi.vercel.app or download the 1.9 GB standalone setup zip directly from GitHub Releases:</w:t>
+        <w:t>• Web Portal: https://offlinerag-psi.vercel.app</w:t>
         <w:br/>
-        <w:t>Download URL: https://github.com/kalakonda-akshay/RAG/releases/latest/download/OfflineRAGAssistant_Setup.zip</w:t>
+        <w:t>• Environment Setup: python launcher/first_run_setup.py</w:t>
         <w:br/>
-        <w:t>Saved File: OfflineRAGAssistant_Setup.zip (1.9 GB)</w:t>
-      </w:r>
-    </w:p>
-    <w:p>
-      <w:r>
-        <w:rPr>
-          <w:b/>
-        </w:rPr>
+        <w:t>• Pull Local LLM Models: ollama pull llama3.2:3b &amp;&amp; ollama pull nomic-embed-text</w:t>
         <w:br/>
-        <w:t>Step 2: Extract &amp; First-Run Environment Setup</w:t>
-        <w:br/>
-      </w:r>
-      <w:r>
-        <w:t>1. Extract OfflineRAGAssistant_Setup.zip to your desired folder (e.g. C:\OrbitAssistant).</w:t>
-        <w:br/>
-        <w:t>2. Open Windows Command Prompt or PowerShell inside the extracted folder.</w:t>
-        <w:br/>
-        <w:t>3. Run the automatic setup wizard:</w:t>
-        <w:br/>
-        <w:t xml:space="preserve">   python launcher/first_run_setup.py</w:t>
-        <w:br/>
-        <w:t>This script verifies your Python environment, installs core dependencies, and configures Ollama.</w:t>
-      </w:r>
-    </w:p>
-    <w:p>
-      <w:r>
-        <w:rPr>
-          <w:b/>
-        </w:rPr>
-        <w:br/>
-        <w:t>Step 3: Download Local AI Models (Ollama)</w:t>
-        <w:br/>
-      </w:r>
-      <w:r>
-        <w:t>Ensure Ollama is running in the background, then pull the local generation &amp; embedding models:</w:t>
-        <w:br/>
-        <w:t xml:space="preserve">   ollama pull llama3.2:3b</w:t>
-        <w:br/>
-        <w:t xml:space="preserve">   ollama pull nomic-embed-text</w:t>
-      </w:r>
-    </w:p>
-    <w:p>
-      <w:r>
-        <w:rPr>
-          <w:b/>
-        </w:rPr>
-        <w:br/>
-        <w:t>Step 4: Launch the Orbit User Interface</w:t>
-        <w:br/>
-      </w:r>
-      <w:r>
-        <w:t>Run the launcher script to open the 3-column interactive workspace in your web browser:</w:t>
-        <w:br/>
-        <w:t xml:space="preserve">   python launcher/run_app.py</w:t>
-        <w:br/>
-        <w:t>Access URL: http://localhost:8501</w:t>
+        <w:t>• Launch Application: python launcher/run_app.py (http://localhost:8501)</w:t>
       </w:r>
     </w:p>
     <w:p>
@@ -259,12 +73,27 @@
         <w:pStyle w:val="Heading1"/>
       </w:pPr>
       <w:r>
-        <w:t>3. Visual Interface &amp; Screenshot Tour</w:t>
+        <w:t>3. Opening the App — Layout &amp; Interface Walkthrough</w:t>
       </w:r>
     </w:p>
     <w:p>
       <w:r>
-        <w:t>Below are live screenshots of Orbit running in real-world scenarios:</w:t>
+        <w:t>When you open Orbit at http://localhost:8501, you are presented with a 3-column interactive layout:</w:t>
+        <w:br/>
+        <w:br/>
+        <w:t>1. Left Knowledge Rail: Brand header, workspace switcher (documents, research, finance, engineering), indexed file cards, upload dropzone, AI persona switcher, export PPTX button.</w:t>
+        <w:br/>
+        <w:t>2. Center Q&amp;A Thread: Scope banner, 12 feature navigation tabs, message stream with [1], [2] citations, interactive source pills, raw text chunk inspector, prompt bar.</w:t>
+        <w:br/>
+        <w:t>3. Right Grounding Rail: Grounding confidence meter (0.91 high), cited document relevance cards, &lt;mark&gt; text highlights, page and chunk markers.</w:t>
+      </w:r>
+    </w:p>
+    <w:p>
+      <w:pPr>
+        <w:pStyle w:val="Heading1"/>
+      </w:pPr>
+      <w:r>
+        <w:t>4. Visual Screenshot Tour</w:t>
       </w:r>
     </w:p>
     <w:p>
@@ -273,11 +102,6 @@
       </w:pPr>
       <w:r>
         <w:t>Figure 1: Grounded Q&amp;A Thread &amp; Interactive Citations</w:t>
-      </w:r>
-    </w:p>
-    <w:p>
-      <w:r>
-        <w:t>Shows the central Q&amp;A chat stream with numbered citation chips [1], [2], interactive source buttons, and raw text chunk inspector:</w:t>
       </w:r>
     </w:p>
     <w:p>
@@ -321,20 +145,10 @@
     </w:p>
     <w:p>
       <w:pPr>
-        <w:spacing w:after="240"/>
-      </w:pPr>
-    </w:p>
-    <w:p>
-      <w:pPr>
         <w:pStyle w:val="Heading2"/>
       </w:pPr>
       <w:r>
         <w:t>Figure 2: Real-Time Voice Call Mode</w:t>
-      </w:r>
-    </w:p>
-    <w:p>
-      <w:r>
-        <w:t>Shows real-time microphone audio recording and local Whisper speech-to-text transcription:</w:t>
       </w:r>
     </w:p>
     <w:p>
@@ -378,20 +192,10 @@
     </w:p>
     <w:p>
       <w:pPr>
-        <w:spacing w:after="240"/>
-      </w:pPr>
-    </w:p>
-    <w:p>
-      <w:pPr>
         <w:pStyle w:val="Heading2"/>
       </w:pPr>
       <w:r>
         <w:t>Figure 3: Auto-Generated Document Quiz Workspace</w:t>
-      </w:r>
-    </w:p>
-    <w:p>
-      <w:r>
-        <w:t>Shows dynamic multiple-choice test questions auto-generated from indexed document contents:</w:t>
       </w:r>
     </w:p>
     <w:p>
@@ -435,15 +239,10 @@
     </w:p>
     <w:p>
       <w:pPr>
-        <w:spacing w:after="240"/>
-      </w:pPr>
-    </w:p>
-    <w:p>
-      <w:pPr>
         <w:pStyle w:val="Heading1"/>
       </w:pPr>
       <w:r>
-        <w:t>4. Complete Feature &amp; Workspace Reference (12 Tabs)</w:t>
+        <w:t>5. Complete Feature &amp; Workspace Reference (12 Tabs)</w:t>
       </w:r>
     </w:p>
     <w:p>
@@ -455,7 +254,7 @@
         <w:t xml:space="preserve">💬 Grounded Q&amp;A Chat: </w:t>
       </w:r>
       <w:r>
-        <w:t>Dense vector search + Rank-BM25 hybrid retrieval + Self-RAG hallucination verification.</w:t>
+        <w:t>Dense vector search + Rank-BM25 hybrid retrieval + Self-RAG verification.</w:t>
       </w:r>
     </w:p>
     <w:p>
@@ -588,31 +387,6 @@
       </w:r>
       <w:r>
         <w:t>Generates 1-click PowerPoint presentations (.pptx) and executive brief summaries.</w:t>
-      </w:r>
-    </w:p>
-    <w:p>
-      <w:pPr>
-        <w:pStyle w:val="Heading1"/>
-      </w:pPr>
-      <w:r>
-        <w:t>5. Supported File Formats (29 Extensions)</w:t>
-      </w:r>
-    </w:p>
-    <w:p>
-      <w:r>
-        <w:t>• Documents &amp; Presentations (5): .pdf, .docx, .pptx, .ppt, .md</w:t>
-        <w:br/>
-        <w:t>• Spreadsheets &amp; Tables (3): .xlsx, .xls, .csv</w:t>
-        <w:br/>
-        <w:t>• Image &amp; OCR (7): .png, .jpg, .jpeg, .webp, .bmp, .tiff, .gif</w:t>
-        <w:br/>
-        <w:t>• Audio Recordings (3): .wav, .mp3, .m4a</w:t>
-        <w:br/>
-        <w:t>• Video Files (4): .mp4, .mkv, .mov, .avi</w:t>
-        <w:br/>
-        <w:t>• Code &amp; Text Markup (7): .txt, .py, .js, .json, .html, .xml, .sql</w:t>
-        <w:br/>
-        <w:t>• Relational DBs (2): .sqlite, .db</w:t>
       </w:r>
     </w:p>
     <w:sectPr>

</xml_diff>